<commit_message>
docs(ao-frdisi): prix final révisé 4 166 600 HT / 4 999 920 TTC (bénéfice cible 1,5 MDH sur coûts Reda 2 666 600) — cascade bordereau/lettre/simulation/checklist appliquée et vérifiée
Co-Authored-By: Claude Fable 5 <noreply@anthropic.com>
</commit_message>
<xml_diff>
--- a/docs/ao-frdisi/releve-2026-07-27/ENVOI_ACCORDIA_MAJ/00 - A REMPLIR PAR ACCORDIA avant depot.docx
+++ b/docs/ao-frdisi/releve-2026-07-27/ENVOI_ACCORDIA_MAJ/00 - A REMPLIR PAR ACCORDIA avant depot.docx
@@ -95,7 +95,7 @@
                 <w:bCs/>
                 <w:color w:val="1D4ED8"/>
               </w:rPr>
-              <w:t xml:space="preserve">4 349 400,00 DH HT — 5 219 280,00 DH TTC</w:t>
+              <w:t xml:space="preserve">4 166 600,00 DH HT — 4 999 920,00 DH TTC</w:t>
             </w:r>
           </w:p>
           <w:p>
@@ -107,7 +107,7 @@
                 <w:i/>
                 <w:iCs/>
               </w:rPr>
-              <w:t xml:space="preserve">En toutes lettres : cinq millions deux cent dix-neuf mille deux cent quatre-vingts dirhams TTC</w:t>
+              <w:t xml:space="preserve">En toutes lettres : quatre millions neuf cent quatre-vingt-dix-neuf mille neuf cent vingt dirhams TTC</w:t>
             </w:r>
           </w:p>
           <w:p>

</xml_diff>